<commit_message>
Initial commit: Proyecto optimizador de CV con licencia propietaria
</commit_message>
<xml_diff>
--- a/templates/cv_profesional.docx
+++ b/templates/cv_profesional.docx
@@ -296,16 +296,6 @@
         </w:rPr>
         <w:t>{% for skill in lista %}</w:t>
       </w:r>
-    </w:p>
-    <w:p>
-      <w:pPr>
-        <w:pStyle w:val="normal1"/>
-        <w:spacing w:lineRule="auto" w:line="240" w:before="240" w:after="240"/>
-        <w:rPr>
-          <w:sz w:val="20"/>
-          <w:szCs w:val="20"/>
-        </w:rPr>
-      </w:pPr>
       <w:r>
         <w:rPr>
           <w:b/>
@@ -473,14 +463,7 @@
           <w:sz w:val="20"/>
           <w:szCs w:val="20"/>
         </w:rPr>
-        <w:t xml:space="preserve">{{r.descripcion}} </w:t>
-      </w:r>
-      <w:r>
-        <w:rPr>
-          <w:sz w:val="20"/>
-          <w:szCs w:val="20"/>
-        </w:rPr>
-        <w:t>{% endfor %}</w:t>
+        <w:t>{{r.descripcion}} {% endfor %}</w:t>
       </w:r>
     </w:p>
     <w:p>
@@ -536,21 +519,7 @@
           <w:sz w:val="20"/>
           <w:szCs w:val="20"/>
         </w:rPr>
-        <w:t xml:space="preserve">{{l.descripcion}} </w:t>
-      </w:r>
-      <w:r>
-        <w:rPr>
-          <w:sz w:val="20"/>
-          <w:szCs w:val="20"/>
-        </w:rPr>
-        <w:t xml:space="preserve">{% endfor %} </w:t>
-      </w:r>
-      <w:r>
-        <w:rPr>
-          <w:sz w:val="20"/>
-          <w:szCs w:val="20"/>
-        </w:rPr>
-        <w:t>{% endfor %}</w:t>
+        <w:t>{{l.descripcion}} {% endfor %} {% endfor %}</w:t>
       </w:r>
     </w:p>
     <w:p>

</xml_diff>